<commit_message>
feat: release v3 jumping task deliverables with task 3 geometry, 50% image layout and #3F98DE lesson plan
</commit_message>
<xml_diff>
--- a/02_教案與學習單/11510_6年級數學_扇形面積跳躍任務_學習單.docx
+++ b/02_教案與學習單/11510_6年級數學_扇形面積跳躍任務_學習單.docx
@@ -9,161 +9,28 @@
       <w:r>
         <w:rPr>
           <w:rFonts w:ascii="微軟正黑體" w:hAnsi="微軟正黑體"/>
-          <w:rFonts w:eastAsia="微軟正黑體"/>
           <w:b/>
-          <w:color w:val="1A365D"/>
           <w:sz w:val="32"/>
         </w:rPr>
-        <w:t>國小六年級數學 學習共同體探究學習單</w:t>
+        <w:t>國小六年級數學 學習共同體探究學習單（第3版）</w:t>
+      </w:r>
+    </w:p>
+    <w:p>
+      <w:r>
+        <w:rPr>
+          <w:rFonts w:ascii="微軟正黑體" w:hAnsi="微軟正黑體"/>
+          <w:sz w:val="21"/>
+        </w:rPr>
+        <w:t>單元六：扇形面積與複合圖形探究 ——【幾何魔法花窗：四葉草綠地的秘密】</w:t>
+        <w:br/>
+        <w:t>班級：六年 ___ 班 ___ 號　　姓名：___________　　組別：第 ___ 組　　日期：115年___月___日</w:t>
       </w:r>
     </w:p>
     <w:p>
       <w:pPr>
-        <w:jc w:val="center"/>
+        <w:pStyle w:val="Heading2"/>
       </w:pPr>
       <w:r>
-        <w:rPr>
-          <w:rFonts w:ascii="微軟正黑體" w:hAnsi="微軟正黑體"/>
-          <w:rFonts w:eastAsia="微軟正黑體"/>
-          <w:b/>
-          <w:color w:val="2B6CB0"/>
-          <w:sz w:val="24"/>
-        </w:rPr>
-        <w:t>單元六：扇形面積與複合圖形探究 ——【幾何魔法花窗：四葉草綠地的秘密】</w:t>
-      </w:r>
-    </w:p>
-    <w:tbl>
-      <w:tblPr>
-        <w:tblW w:type="auto" w:w="0"/>
-        <w:jc w:val="center"/>
-        <w:tblLook w:firstColumn="1" w:firstRow="1" w:lastColumn="0" w:lastRow="0" w:noHBand="0" w:noVBand="1" w:val="04A0"/>
-      </w:tblPr>
-      <w:tblGrid>
-        <w:gridCol w:w="2628"/>
-        <w:gridCol w:w="2628"/>
-        <w:gridCol w:w="2628"/>
-        <w:gridCol w:w="2628"/>
-      </w:tblGrid>
-      <w:tr>
-        <w:tc>
-          <w:tcPr>
-            <w:tcW w:type="dxa" w:w="2628"/>
-            <w:tcMar>
-              <w:top w:w="30" w:type="dxa"/>
-              <w:bottom w:w="30" w:type="dxa"/>
-              <w:left w:w="40" w:type="dxa"/>
-              <w:right w:w="40" w:type="dxa"/>
-            </w:tcMar>
-            <w:shd w:fill="F7FAFC"/>
-          </w:tcPr>
-          <w:p>
-            <w:pPr>
-              <w:spacing w:line="276" w:lineRule="auto" w:after="40" w:before="40"/>
-              <w:jc w:val="center"/>
-            </w:pPr>
-            <w:r>
-              <w:rPr>
-                <w:rFonts w:ascii="微軟正黑體" w:hAnsi="微軟正黑體"/>
-                <w:rFonts w:eastAsia="微軟正黑體"/>
-                <w:b/>
-                <w:sz w:val="19"/>
-              </w:rPr>
-              <w:t>六年 ___ 班 ___ 號</w:t>
-            </w:r>
-          </w:p>
-        </w:tc>
-        <w:tc>
-          <w:tcPr>
-            <w:tcW w:type="dxa" w:w="2628"/>
-            <w:tcMar>
-              <w:top w:w="30" w:type="dxa"/>
-              <w:bottom w:w="30" w:type="dxa"/>
-              <w:left w:w="40" w:type="dxa"/>
-              <w:right w:w="40" w:type="dxa"/>
-            </w:tcMar>
-            <w:shd w:fill="F7FAFC"/>
-          </w:tcPr>
-          <w:p>
-            <w:pPr>
-              <w:spacing w:line="276" w:lineRule="auto" w:after="40" w:before="40"/>
-              <w:jc w:val="center"/>
-            </w:pPr>
-            <w:r>
-              <w:rPr>
-                <w:rFonts w:ascii="微軟正黑體" w:hAnsi="微軟正黑體"/>
-                <w:rFonts w:eastAsia="微軟正黑體"/>
-                <w:b/>
-                <w:sz w:val="19"/>
-              </w:rPr>
-              <w:t>姓名：___________</w:t>
-            </w:r>
-          </w:p>
-        </w:tc>
-        <w:tc>
-          <w:tcPr>
-            <w:tcW w:type="dxa" w:w="2628"/>
-            <w:tcMar>
-              <w:top w:w="30" w:type="dxa"/>
-              <w:bottom w:w="30" w:type="dxa"/>
-              <w:left w:w="40" w:type="dxa"/>
-              <w:right w:w="40" w:type="dxa"/>
-            </w:tcMar>
-            <w:shd w:fill="F7FAFC"/>
-          </w:tcPr>
-          <w:p>
-            <w:pPr>
-              <w:spacing w:line="276" w:lineRule="auto" w:after="40" w:before="40"/>
-              <w:jc w:val="center"/>
-            </w:pPr>
-            <w:r>
-              <w:rPr>
-                <w:rFonts w:ascii="微軟正黑體" w:hAnsi="微軟正黑體"/>
-                <w:rFonts w:eastAsia="微軟正黑體"/>
-                <w:b/>
-                <w:sz w:val="19"/>
-              </w:rPr>
-              <w:t>組別：第 ___ 組</w:t>
-            </w:r>
-          </w:p>
-        </w:tc>
-        <w:tc>
-          <w:tcPr>
-            <w:tcW w:type="dxa" w:w="2628"/>
-            <w:tcMar>
-              <w:top w:w="30" w:type="dxa"/>
-              <w:bottom w:w="30" w:type="dxa"/>
-              <w:left w:w="40" w:type="dxa"/>
-              <w:right w:w="40" w:type="dxa"/>
-            </w:tcMar>
-            <w:shd w:fill="F7FAFC"/>
-          </w:tcPr>
-          <w:p>
-            <w:pPr>
-              <w:spacing w:line="276" w:lineRule="auto" w:after="40" w:before="40"/>
-              <w:jc w:val="center"/>
-            </w:pPr>
-            <w:r>
-              <w:rPr>
-                <w:rFonts w:ascii="微軟正黑體" w:hAnsi="微軟正黑體"/>
-                <w:rFonts w:eastAsia="微軟正黑體"/>
-                <w:b/>
-                <w:sz w:val="19"/>
-              </w:rPr>
-              <w:t>日期：115年___月___日</w:t>
-            </w:r>
-          </w:p>
-        </w:tc>
-      </w:tr>
-    </w:tbl>
-    <w:p/>
-    <w:p>
-      <w:r>
-        <w:rPr>
-          <w:rFonts w:ascii="微軟正黑體" w:hAnsi="微軟正黑體"/>
-          <w:b/>
-          <w:color w:val="1A365D"/>
-          <w:sz w:val="22"/>
-        </w:rPr>
         <w:t>🌱 第一部分：暖身自學 —— 尋找神奇小鑰匙（個人思考 5~7 分鐘）</w:t>
       </w:r>
     </w:p>
@@ -174,340 +41,87 @@
         <w:tblLook w:firstColumn="1" w:firstRow="1" w:lastColumn="0" w:lastRow="0" w:noHBand="0" w:noVBand="1" w:val="04A0"/>
       </w:tblPr>
       <w:tblGrid>
-        <w:gridCol w:w="5256"/>
-        <w:gridCol w:w="5256"/>
+        <w:gridCol w:w="5112"/>
+        <w:gridCol w:w="5112"/>
       </w:tblGrid>
       <w:tr>
         <w:tc>
           <w:tcPr>
-            <w:tcW w:type="dxa" w:w="5256"/>
+            <w:tcW w:type="dxa" w:w="6048"/>
             <w:tcMar>
-              <w:top w:w="60" w:type="dxa"/>
-              <w:bottom w:w="60" w:type="dxa"/>
-              <w:left w:w="80" w:type="dxa"/>
-              <w:right w:w="80" w:type="dxa"/>
+              <w:top w:w="120" w:type="dxa"/>
+              <w:bottom w:w="120" w:type="dxa"/>
+              <w:left w:w="150" w:type="dxa"/>
+              <w:right w:w="150" w:type="dxa"/>
             </w:tcMar>
-            <w:shd w:fill="F7FAFC"/>
+            <w:shd w:fill="EBF5FC"/>
           </w:tcPr>
           <w:p>
-            <w:pPr>
-              <w:spacing w:line="276" w:lineRule="auto" w:after="40" w:before="40"/>
-              <w:jc w:val="left"/>
-            </w:pPr>
             <w:r>
-              <w:rPr>
-                <w:rFonts w:ascii="微軟正黑體" w:hAnsi="微軟正黑體"/>
-                <w:rFonts w:eastAsia="微軟正黑體"/>
-                <w:b w:val="0"/>
-                <w:sz w:val="18"/>
-              </w:rPr>
-              <w:t>【基礎任務】：</w:t>
-            </w:r>
-          </w:p>
-          <w:p>
-            <w:pPr>
-              <w:spacing w:line="276" w:lineRule="auto" w:after="40" w:before="40"/>
-              <w:jc w:val="left"/>
-            </w:pPr>
-            <w:r>
-              <w:rPr>
-                <w:rFonts w:ascii="微軟正黑體" w:hAnsi="微軟正黑體"/>
-                <w:rFonts w:eastAsia="微軟正黑體"/>
-                <w:b w:val="0"/>
-                <w:sz w:val="18"/>
-              </w:rPr>
+              <w:t>【基礎任務（第 1 題）】</w:t>
+              <w:br/>
               <w:t>在一個邊長 10 公分的正方形中：</w:t>
-            </w:r>
-          </w:p>
-          <w:p>
-            <w:pPr>
-              <w:spacing w:line="276" w:lineRule="auto" w:after="40" w:before="40"/>
-              <w:jc w:val="left"/>
-            </w:pPr>
-            <w:r>
-              <w:rPr>
-                <w:rFonts w:ascii="微軟正黑體" w:hAnsi="微軟正黑體"/>
-                <w:rFonts w:eastAsia="微軟正黑體"/>
-                <w:b w:val="0"/>
-                <w:sz w:val="18"/>
-              </w:rPr>
+              <w:br/>
               <w:t>1. 以頂點為圓心、半徑 10 公分畫 1/4 圓扇形。</w:t>
-            </w:r>
-          </w:p>
-          <w:p>
-            <w:pPr>
-              <w:spacing w:line="276" w:lineRule="auto" w:after="40" w:before="40"/>
-              <w:jc w:val="left"/>
-            </w:pPr>
-            <w:r>
-              <w:rPr>
-                <w:rFonts w:ascii="微軟正黑體" w:hAnsi="微軟正黑體"/>
-                <w:rFonts w:eastAsia="微軟正黑體"/>
-                <w:b w:val="0"/>
-                <w:sz w:val="18"/>
-              </w:rPr>
+              <w:br/>
               <w:t>2. 連接對角線形成等腰直角三角形。</w:t>
-            </w:r>
-          </w:p>
-          <w:p>
-            <w:pPr>
-              <w:spacing w:line="276" w:lineRule="auto" w:after="40" w:before="40"/>
-              <w:jc w:val="left"/>
-            </w:pPr>
-            <w:r>
-              <w:rPr>
-                <w:rFonts w:ascii="微軟正黑體" w:hAnsi="微軟正黑體"/>
-                <w:rFonts w:eastAsia="微軟正黑體"/>
-                <w:b w:val="0"/>
-                <w:sz w:val="18"/>
-              </w:rPr>
-              <w:t>★ 請算出塗色「小葉片（弓形）」的面積是多少平方公分？</w:t>
-            </w:r>
-          </w:p>
-          <w:p>
-            <w:pPr>
-              <w:spacing w:line="276" w:lineRule="auto" w:after="40" w:before="40"/>
-              <w:jc w:val="left"/>
-            </w:pPr>
-            <w:r>
-              <w:rPr>
-                <w:rFonts w:ascii="微軟正黑體" w:hAnsi="微軟正黑體"/>
-                <w:rFonts w:eastAsia="微軟正黑體"/>
-                <w:b w:val="0"/>
-                <w:sz w:val="18"/>
-              </w:rPr>
-              <w:t>（圓周率請以 3.14 計算）</w:t>
-            </w:r>
-          </w:p>
-          <w:p>
-            <w:pPr>
-              <w:spacing w:line="276" w:lineRule="auto" w:after="40" w:before="40"/>
-              <w:jc w:val="left"/>
-            </w:pPr>
-            <w:r>
-              <w:rPr>
-                <w:rFonts w:ascii="微軟正黑體" w:hAnsi="微軟正黑體"/>
-                <w:rFonts w:eastAsia="微軟正黑體"/>
-                <w:b w:val="0"/>
-                <w:sz w:val="18"/>
-              </w:rPr>
-            </w:r>
-          </w:p>
-          <w:p>
-            <w:pPr>
-              <w:spacing w:line="276" w:lineRule="auto" w:after="40" w:before="40"/>
-              <w:jc w:val="left"/>
-            </w:pPr>
-            <w:r>
-              <w:rPr>
-                <w:rFonts w:ascii="微軟正黑體" w:hAnsi="微軟正黑體"/>
-                <w:rFonts w:eastAsia="微軟正黑體"/>
-                <w:b w:val="0"/>
-                <w:sz w:val="18"/>
-              </w:rPr>
-              <w:t>【我的幾何透視想法】：</w:t>
-            </w:r>
-          </w:p>
-          <w:p>
-            <w:pPr>
-              <w:spacing w:line="276" w:lineRule="auto" w:after="40" w:before="40"/>
-              <w:jc w:val="left"/>
-            </w:pPr>
-            <w:r>
-              <w:rPr>
-                <w:rFonts w:ascii="微軟正黑體" w:hAnsi="微軟正黑體"/>
-                <w:rFonts w:eastAsia="微軟正黑體"/>
-                <w:b w:val="0"/>
-                <w:sz w:val="18"/>
-              </w:rPr>
-              <w:t>• 塗色葉片面積 = ________________ - ________________</w:t>
+              <w:br/>
+              <w:t>★ 請算出塗色「小葉片（弓形）」的面積是多少平方公分？（圓周率請以 3.14 計算）</w:t>
+              <w:br/>
+              <w:br/>
+              <w:t>【我的幾何透視與算式】：</w:t>
+              <w:br/>
+              <w:br/>
+              <w:br/>
+              <w:br/>
+              <w:t>答：________________ 平方公分</w:t>
             </w:r>
           </w:p>
         </w:tc>
         <w:tc>
           <w:tcPr>
-            <w:tcW w:type="dxa" w:w="5256"/>
+            <w:tcW w:type="dxa" w:w="3744"/>
             <w:tcMar>
-              <w:top w:w="60" w:type="dxa"/>
-              <w:bottom w:w="60" w:type="dxa"/>
-              <w:left w:w="80" w:type="dxa"/>
-              <w:right w:w="80" w:type="dxa"/>
+              <w:top w:w="120" w:type="dxa"/>
+              <w:bottom w:w="120" w:type="dxa"/>
+              <w:left w:w="150" w:type="dxa"/>
+              <w:right w:w="150" w:type="dxa"/>
             </w:tcMar>
           </w:tcPr>
           <w:p>
-            <w:pPr>
-              <w:spacing w:line="264" w:lineRule="auto" w:after="40" w:before="40"/>
-              <w:jc w:val="left"/>
-            </w:pPr>
             <w:r>
-              <w:rPr>
-                <w:rFonts w:ascii="微軟正黑體" w:hAnsi="微軟正黑體"/>
-                <w:rFonts w:eastAsia="微軟正黑體"/>
-                <w:b w:val="0"/>
-                <w:sz w:val="18"/>
-              </w:rPr>
-              <w:t>【我的算式與計算過程】：</w:t>
-            </w:r>
-          </w:p>
-          <w:p>
-            <w:pPr>
-              <w:spacing w:line="264" w:lineRule="auto" w:after="40" w:before="40"/>
-              <w:jc w:val="left"/>
-            </w:pPr>
-            <w:r>
-              <w:rPr>
-                <w:rFonts w:ascii="微軟正黑體" w:hAnsi="微軟正黑體"/>
-                <w:rFonts w:eastAsia="微軟正黑體"/>
-                <w:b w:val="0"/>
-                <w:sz w:val="18"/>
-              </w:rPr>
-            </w:r>
-          </w:p>
-          <w:p>
-            <w:pPr>
-              <w:spacing w:line="264" w:lineRule="auto" w:after="40" w:before="40"/>
-              <w:jc w:val="left"/>
-            </w:pPr>
-            <w:r>
-              <w:rPr>
-                <w:rFonts w:ascii="微軟正黑體" w:hAnsi="微軟正黑體"/>
-                <w:rFonts w:eastAsia="微軟正黑體"/>
-                <w:b w:val="0"/>
-                <w:sz w:val="18"/>
-              </w:rPr>
-              <w:t>1/4 圓扇形面積：</w:t>
-            </w:r>
-          </w:p>
-          <w:p>
-            <w:pPr>
-              <w:spacing w:line="264" w:lineRule="auto" w:after="40" w:before="40"/>
-              <w:jc w:val="left"/>
-            </w:pPr>
-            <w:r>
-              <w:rPr>
-                <w:rFonts w:ascii="微軟正黑體" w:hAnsi="微軟正黑體"/>
-                <w:rFonts w:eastAsia="微軟正黑體"/>
-                <w:b w:val="0"/>
-                <w:sz w:val="18"/>
-              </w:rPr>
-              <w:t>10 × 10 × 3.14 × (1/4) = 78.5 (cm²)</w:t>
-            </w:r>
-          </w:p>
-          <w:p>
-            <w:pPr>
-              <w:spacing w:line="264" w:lineRule="auto" w:after="40" w:before="40"/>
-              <w:jc w:val="left"/>
-            </w:pPr>
-            <w:r>
-              <w:rPr>
-                <w:rFonts w:ascii="微軟正黑體" w:hAnsi="微軟正黑體"/>
-                <w:rFonts w:eastAsia="微軟正黑體"/>
-                <w:b w:val="0"/>
-                <w:sz w:val="18"/>
-              </w:rPr>
-            </w:r>
-          </w:p>
-          <w:p>
-            <w:pPr>
-              <w:spacing w:line="264" w:lineRule="auto" w:after="40" w:before="40"/>
-              <w:jc w:val="left"/>
-            </w:pPr>
-            <w:r>
-              <w:rPr>
-                <w:rFonts w:ascii="微軟正黑體" w:hAnsi="微軟正黑體"/>
-                <w:rFonts w:eastAsia="微軟正黑體"/>
-                <w:b w:val="0"/>
-                <w:sz w:val="18"/>
-              </w:rPr>
-              <w:t>直角三角形面積：</w:t>
-            </w:r>
-          </w:p>
-          <w:p>
-            <w:pPr>
-              <w:spacing w:line="264" w:lineRule="auto" w:after="40" w:before="40"/>
-              <w:jc w:val="left"/>
-            </w:pPr>
-            <w:r>
-              <w:rPr>
-                <w:rFonts w:ascii="微軟正黑體" w:hAnsi="微軟正黑體"/>
-                <w:rFonts w:eastAsia="微軟正黑體"/>
-                <w:b w:val="0"/>
-                <w:sz w:val="18"/>
-              </w:rPr>
-              <w:t>10 × 10 ÷ 2 = 50 (cm²)</w:t>
-            </w:r>
-          </w:p>
-          <w:p>
-            <w:pPr>
-              <w:spacing w:line="264" w:lineRule="auto" w:after="40" w:before="40"/>
-              <w:jc w:val="left"/>
-            </w:pPr>
-            <w:r>
-              <w:rPr>
-                <w:rFonts w:ascii="微軟正黑體" w:hAnsi="微軟正黑體"/>
-                <w:rFonts w:eastAsia="微軟正黑體"/>
-                <w:b w:val="0"/>
-                <w:sz w:val="18"/>
-              </w:rPr>
-            </w:r>
-          </w:p>
-          <w:p>
-            <w:pPr>
-              <w:spacing w:line="264" w:lineRule="auto" w:after="40" w:before="40"/>
-              <w:jc w:val="left"/>
-            </w:pPr>
-            <w:r>
-              <w:rPr>
-                <w:rFonts w:ascii="微軟正黑體" w:hAnsi="微軟正黑體"/>
-                <w:rFonts w:eastAsia="微軟正黑體"/>
-                <w:b w:val="0"/>
-                <w:sz w:val="18"/>
-              </w:rPr>
-              <w:t>小葉片（弓形）面積：</w:t>
-            </w:r>
-          </w:p>
-          <w:p>
-            <w:pPr>
-              <w:spacing w:line="264" w:lineRule="auto" w:after="40" w:before="40"/>
-              <w:jc w:val="left"/>
-            </w:pPr>
-            <w:r>
-              <w:rPr>
-                <w:rFonts w:ascii="微軟正黑體" w:hAnsi="微軟正黑體"/>
-                <w:rFonts w:eastAsia="微軟正黑體"/>
-                <w:b w:val="0"/>
-                <w:sz w:val="18"/>
-              </w:rPr>
-              <w:t>78.5 - 50 = 28.5 (cm²)</w:t>
-            </w:r>
-          </w:p>
-          <w:p>
-            <w:pPr>
-              <w:spacing w:line="264" w:lineRule="auto" w:after="40" w:before="40"/>
-              <w:jc w:val="left"/>
-            </w:pPr>
-            <w:r>
-              <w:rPr>
-                <w:rFonts w:ascii="微軟正黑體" w:hAnsi="微軟正黑體"/>
-                <w:rFonts w:eastAsia="微軟正黑體"/>
-                <w:b w:val="0"/>
-                <w:sz w:val="18"/>
-              </w:rPr>
-            </w:r>
-          </w:p>
-          <w:p>
-            <w:pPr>
-              <w:spacing w:line="264" w:lineRule="auto" w:after="40" w:before="40"/>
-              <w:jc w:val="left"/>
-            </w:pPr>
-            <w:r>
-              <w:rPr>
-                <w:rFonts w:ascii="微軟正黑體" w:hAnsi="微軟正黑體"/>
-                <w:rFonts w:eastAsia="微軟正黑體"/>
-                <w:b w:val="0"/>
-                <w:sz w:val="18"/>
-              </w:rPr>
-              <w:t>答：___________ 平方公分</w:t>
+              <w:drawing>
+                <wp:inline xmlns:a="http://schemas.openxmlformats.org/drawingml/2006/main" xmlns:pic="http://schemas.openxmlformats.org/drawingml/2006/picture">
+                  <wp:extent cx="2194560" cy="2110723"/>
+                  <wp:docPr id="1" name="Picture 1"/>
+                  <wp:cNvGraphicFramePr>
+                    <a:graphicFrameLocks noChangeAspect="1"/>
+                  </wp:cNvGraphicFramePr>
+                  <a:graphic>
+                    <a:graphicData uri="http://schemas.openxmlformats.org/drawingml/2006/picture">
+                      <pic:pic>
+                        <pic:nvPicPr>
+                          <pic:cNvPr id="0" name="基礎任務_幾何題目圖.png"/>
+                          <pic:cNvPicPr/>
+                        </pic:nvPicPr>
+                        <pic:blipFill>
+                          <a:blip r:embed="rId9"/>
+                          <a:stretch>
+                            <a:fillRect/>
+                          </a:stretch>
+                        </pic:blipFill>
+                        <pic:spPr>
+                          <a:xfrm>
+                            <a:off x="0" y="0"/>
+                            <a:ext cx="2194560" cy="2110723"/>
+                          </a:xfrm>
+                          <a:prstGeom prst="rect"/>
+                        </pic:spPr>
+                      </pic:pic>
+                    </a:graphicData>
+                  </a:graphic>
+                </wp:inline>
+              </w:drawing>
             </w:r>
           </w:p>
         </w:tc>
@@ -515,14 +129,11 @@
     </w:tbl>
     <w:p/>
     <w:p>
+      <w:pPr>
+        <w:pStyle w:val="Heading2"/>
+      </w:pPr>
       <w:r>
-        <w:rPr>
-          <w:rFonts w:ascii="微軟正黑體" w:hAnsi="微軟正黑體"/>
-          <w:b/>
-          <w:color w:val="1A365D"/>
-          <w:sz w:val="22"/>
-        </w:rPr>
-        <w:t>🚀 第二部分：伸展跳躍任務 —— 四葉草綠地的秘密（小組協同共學 15 分鐘）</w:t>
+        <w:t>🚀 第二部分：伸展跳躍任務一 —— 四葉草綠地的秘密（小組協同 15 分鐘）</w:t>
       </w:r>
     </w:p>
     <w:tbl>
@@ -532,89 +143,56 @@
         <w:tblLook w:firstColumn="1" w:firstRow="1" w:lastColumn="0" w:lastRow="0" w:noHBand="0" w:noVBand="1" w:val="04A0"/>
       </w:tblPr>
       <w:tblGrid>
-        <w:gridCol w:w="5256"/>
-        <w:gridCol w:w="5256"/>
+        <w:gridCol w:w="5112"/>
+        <w:gridCol w:w="5112"/>
       </w:tblGrid>
       <w:tr>
         <w:tc>
           <w:tcPr>
-            <w:tcW w:type="dxa" w:w="5256"/>
+            <w:tcW w:type="dxa" w:w="6048"/>
             <w:tcMar>
-              <w:top w:w="60" w:type="dxa"/>
-              <w:bottom w:w="60" w:type="dxa"/>
-              <w:left w:w="80" w:type="dxa"/>
-              <w:right w:w="80" w:type="dxa"/>
+              <w:top w:w="120" w:type="dxa"/>
+              <w:bottom w:w="120" w:type="dxa"/>
+              <w:left w:w="150" w:type="dxa"/>
+              <w:right w:w="150" w:type="dxa"/>
             </w:tcMar>
-            <w:shd w:fill="EBF8FF"/>
+            <w:shd w:fill="EBF5FC"/>
           </w:tcPr>
           <w:p>
-            <w:pPr>
-              <w:spacing w:line="288" w:lineRule="auto" w:after="40" w:before="40"/>
-              <w:jc w:val="left"/>
-            </w:pPr>
             <w:r>
-              <w:rPr>
-                <w:rFonts w:ascii="微軟正黑體" w:hAnsi="微軟正黑體"/>
-                <w:rFonts w:eastAsia="微軟正黑體"/>
-                <w:b/>
-                <w:color w:val="1A365D"/>
-                <w:sz w:val="19"/>
-              </w:rPr>
-              <w:t>【創客校園景觀設計情境】：</w:t>
-            </w:r>
-          </w:p>
-          <w:p>
-            <w:pPr>
-              <w:spacing w:line="288" w:lineRule="auto" w:after="40" w:before="40"/>
-              <w:jc w:val="left"/>
-            </w:pPr>
-            <w:r>
-              <w:rPr>
-                <w:rFonts w:ascii="微軟正黑體" w:hAnsi="微軟正黑體"/>
-                <w:rFonts w:eastAsia="微軟正黑體"/>
-                <w:b/>
-                <w:color w:val="1A365D"/>
-                <w:sz w:val="19"/>
-              </w:rPr>
-              <w:t>學校要在中庭打造一塊邊長 20 公尺的正方形智慧草坪。設計師將花圃切成 4 個 10m×10m 的小正方形，在每個小正方形內以頂點為圓心畫半徑 10 公尺圓弧，向四個角落對角線交織出美麗的「四葉草花瓣綠地」（如右圖）。</w:t>
-            </w:r>
-          </w:p>
-          <w:p>
-            <w:pPr>
-              <w:spacing w:line="288" w:lineRule="auto" w:after="40" w:before="40"/>
-              <w:jc w:val="left"/>
-            </w:pPr>
-            <w:r>
-              <w:rPr>
-                <w:rFonts w:ascii="微軟正黑體" w:hAnsi="微軟正黑體"/>
-                <w:rFonts w:eastAsia="微軟正黑體"/>
-                <w:b/>
-                <w:color w:val="1A365D"/>
-                <w:sz w:val="19"/>
-              </w:rPr>
-              <w:t>★ 伸展挑戰：這四片「四葉草花瓣」的總面積是多少平方公尺？（π ≈ 3.14）</w:t>
+              <w:t>【創客校園景觀設計情境（第 2 題）】</w:t>
+              <w:br/>
+              <w:t>學校要在中庭打造一塊邊長 20 公尺的正方形草坪。設計師以四個邊為直徑向內各畫一個半圓（半徑 10m），交疊出中央美麗的「四葉草花壇」（4 片花瓣）。</w:t>
+              <w:br/>
+              <w:t>★ 伸展挑戰：這 4 片花瓣的總面積是多少平方公尺？（圓周率請以 3.14 計算）</w:t>
+              <w:br/>
+              <w:br/>
+              <w:t>【小組解題策略紀錄（分割法 / 容斥法）】：</w:t>
+              <w:br/>
+              <w:br/>
+              <w:br/>
+              <w:br/>
+              <w:br/>
+              <w:t>答：________________ 平方公尺</w:t>
             </w:r>
           </w:p>
         </w:tc>
         <w:tc>
           <w:tcPr>
-            <w:tcW w:type="dxa" w:w="5256"/>
+            <w:tcW w:type="dxa" w:w="3744"/>
             <w:tcMar>
-              <w:top w:w="60" w:type="dxa"/>
-              <w:bottom w:w="60" w:type="dxa"/>
-              <w:left w:w="80" w:type="dxa"/>
-              <w:right w:w="80" w:type="dxa"/>
+              <w:top w:w="120" w:type="dxa"/>
+              <w:bottom w:w="120" w:type="dxa"/>
+              <w:left w:w="150" w:type="dxa"/>
+              <w:right w:w="150" w:type="dxa"/>
             </w:tcMar>
           </w:tcPr>
           <w:p>
-            <w:pPr>
-              <w:jc w:val="center"/>
-            </w:pPr>
             <w:r>
               <w:drawing>
                 <wp:inline xmlns:a="http://schemas.openxmlformats.org/drawingml/2006/main" xmlns:pic="http://schemas.openxmlformats.org/drawingml/2006/picture">
-                  <wp:extent cx="2194560" cy="2194560"/>
-                  <wp:docPr id="1" name="Picture 1"/>
+                  <wp:extent cx="2194560" cy="2130449"/>
+                  <wp:docPr id="2" name="Picture 2"/>
                   <wp:cNvGraphicFramePr>
                     <a:graphicFrameLocks noChangeAspect="1"/>
                   </wp:cNvGraphicFramePr>
@@ -622,11 +200,116 @@
                     <a:graphicData uri="http://schemas.openxmlformats.org/drawingml/2006/picture">
                       <pic:pic>
                         <pic:nvPicPr>
-                          <pic:cNvPr id="0" name="clover_task_clean.png"/>
+                          <pic:cNvPr id="0" name="挑戰任務_幾何題目圖.png"/>
                           <pic:cNvPicPr/>
                         </pic:nvPicPr>
                         <pic:blipFill>
-                          <a:blip r:embed="rId9"/>
+                          <a:blip r:embed="rId10"/>
+                          <a:stretch>
+                            <a:fillRect/>
+                          </a:stretch>
+                        </pic:blipFill>
+                        <pic:spPr>
+                          <a:xfrm>
+                            <a:off x="0" y="0"/>
+                            <a:ext cx="2194560" cy="2130449"/>
+                          </a:xfrm>
+                          <a:prstGeom prst="rect"/>
+                        </pic:spPr>
+                      </pic:pic>
+                    </a:graphicData>
+                  </a:graphic>
+                </wp:inline>
+              </w:drawing>
+            </w:r>
+          </w:p>
+        </w:tc>
+      </w:tr>
+    </w:tbl>
+    <w:p/>
+    <w:p>
+      <w:pPr>
+        <w:pStyle w:val="Heading2"/>
+      </w:pPr>
+      <w:r>
+        <w:t>🎯 第三部分：伸展跳躍任務二 —— 雙半圓交疊花窗（進階挑戰 10 分鐘）</w:t>
+      </w:r>
+    </w:p>
+    <w:tbl>
+      <w:tblPr>
+        <w:tblW w:type="auto" w:w="0"/>
+        <w:jc w:val="center"/>
+        <w:tblLook w:firstColumn="1" w:firstRow="1" w:lastColumn="0" w:lastRow="0" w:noHBand="0" w:noVBand="1" w:val="04A0"/>
+      </w:tblPr>
+      <w:tblGrid>
+        <w:gridCol w:w="5112"/>
+        <w:gridCol w:w="5112"/>
+      </w:tblGrid>
+      <w:tr>
+        <w:tc>
+          <w:tcPr>
+            <w:tcW w:type="dxa" w:w="6048"/>
+            <w:tcMar>
+              <w:top w:w="120" w:type="dxa"/>
+              <w:bottom w:w="120" w:type="dxa"/>
+              <w:left w:w="150" w:type="dxa"/>
+              <w:right w:w="150" w:type="dxa"/>
+            </w:tcMar>
+            <w:shd w:fill="F0FFF4"/>
+          </w:tcPr>
+          <w:p>
+            <w:r>
+              <w:t>【幾何進階任務（第 3 題）】</w:t>
+              <w:br/>
+              <w:t>在一個邊長 16 公分的正方形中：</w:t>
+              <w:br/>
+              <w:t>1. 以頂部邊長為直徑（半徑 8 cm）向內作一半圓。</w:t>
+              <w:br/>
+              <w:t>2. 以左側邊長為直徑（半徑 8 cm）向內作一半圓。</w:t>
+              <w:br/>
+              <w:t>3. 兩半圓交疊出左上「透光葉片」，右下為「未被兩半圓覆蓋之區域」。</w:t>
+              <w:br/>
+              <w:t>★ 請算出塗色區域（左上葉片 ＋ 右下區域）的總面積是多少平方公分？（圓周率以 3.14 計算）</w:t>
+              <w:br/>
+              <w:br/>
+              <w:t>【我的幾何透視想法與算式】：</w:t>
+              <w:br/>
+              <w:br/>
+              <w:br/>
+              <w:br/>
+              <w:br/>
+              <w:t>答：________________ 平方公分</w:t>
+            </w:r>
+          </w:p>
+        </w:tc>
+        <w:tc>
+          <w:tcPr>
+            <w:tcW w:type="dxa" w:w="3744"/>
+            <w:tcMar>
+              <w:top w:w="120" w:type="dxa"/>
+              <w:bottom w:w="120" w:type="dxa"/>
+              <w:left w:w="150" w:type="dxa"/>
+              <w:right w:w="150" w:type="dxa"/>
+            </w:tcMar>
+          </w:tcPr>
+          <w:p>
+            <w:r>
+              <w:drawing>
+                <wp:inline xmlns:a="http://schemas.openxmlformats.org/drawingml/2006/main" xmlns:pic="http://schemas.openxmlformats.org/drawingml/2006/picture">
+                  <wp:extent cx="2194560" cy="2194560"/>
+                  <wp:docPr id="3" name="Picture 3"/>
+                  <wp:cNvGraphicFramePr>
+                    <a:graphicFrameLocks noChangeAspect="1"/>
+                  </wp:cNvGraphicFramePr>
+                  <a:graphic>
+                    <a:graphicData uri="http://schemas.openxmlformats.org/drawingml/2006/picture">
+                      <pic:pic>
+                        <pic:nvPicPr>
+                          <pic:cNvPr id="0" name="幾何任務3_幾何題目圖.png"/>
+                          <pic:cNvPicPr/>
+                        </pic:nvPicPr>
+                        <pic:blipFill>
+                          <a:blip r:embed="rId11"/>
                           <a:stretch>
                             <a:fillRect/>
                           </a:stretch>
@@ -649,282 +332,36 @@
       </w:tr>
     </w:tbl>
     <w:p/>
-    <w:tbl>
-      <w:tblPr>
-        <w:tblW w:type="auto" w:w="0"/>
-        <w:jc w:val="center"/>
-        <w:tblLook w:firstColumn="1" w:firstRow="1" w:lastColumn="0" w:lastRow="0" w:noHBand="0" w:noVBand="1" w:val="04A0"/>
-      </w:tblPr>
-      <w:tblGrid>
-        <w:gridCol w:w="5256"/>
-        <w:gridCol w:w="5256"/>
-      </w:tblGrid>
-      <w:tr>
-        <w:tc>
-          <w:tcPr>
-            <w:tcW w:type="dxa" w:w="5256"/>
-            <w:tcMar>
-              <w:top w:w="60" w:type="dxa"/>
-              <w:bottom w:w="60" w:type="dxa"/>
-              <w:left w:w="80" w:type="dxa"/>
-              <w:right w:w="80" w:type="dxa"/>
-            </w:tcMar>
-          </w:tcPr>
-          <w:p>
-            <w:pPr>
-              <w:spacing w:line="276" w:lineRule="auto" w:after="40" w:before="40"/>
-              <w:jc w:val="left"/>
-            </w:pPr>
-            <w:r>
-              <w:rPr>
-                <w:rFonts w:ascii="微軟正黑體" w:hAnsi="微軟正黑體"/>
-                <w:rFonts w:eastAsia="微軟正黑體"/>
-                <w:b w:val="0"/>
-                <w:sz w:val="18"/>
-              </w:rPr>
-              <w:t>【解題策略一：分割小正方形法】</w:t>
-            </w:r>
-          </w:p>
-          <w:p>
-            <w:pPr>
-              <w:spacing w:line="276" w:lineRule="auto" w:after="40" w:before="40"/>
-              <w:jc w:val="left"/>
-            </w:pPr>
-            <w:r>
-              <w:rPr>
-                <w:rFonts w:ascii="微軟正黑體" w:hAnsi="微軟正黑體"/>
-                <w:rFonts w:eastAsia="微軟正黑體"/>
-                <w:b w:val="0"/>
-                <w:sz w:val="18"/>
-              </w:rPr>
-              <w:t>★ 觀察想法：切成 4 個 10×10 小正方形！</w:t>
-            </w:r>
-          </w:p>
-          <w:p>
-            <w:pPr>
-              <w:spacing w:line="276" w:lineRule="auto" w:after="40" w:before="40"/>
-              <w:jc w:val="left"/>
-            </w:pPr>
-            <w:r>
-              <w:rPr>
-                <w:rFonts w:ascii="微軟正黑體" w:hAnsi="微軟正黑體"/>
-                <w:rFonts w:eastAsia="微軟正黑體"/>
-                <w:b w:val="0"/>
-                <w:sz w:val="18"/>
-              </w:rPr>
-              <w:t>我的算式與推理：</w:t>
-            </w:r>
-          </w:p>
-          <w:p>
-            <w:pPr>
-              <w:spacing w:line="276" w:lineRule="auto" w:after="40" w:before="40"/>
-              <w:jc w:val="left"/>
-            </w:pPr>
-            <w:r>
-              <w:rPr>
-                <w:rFonts w:ascii="微軟正黑體" w:hAnsi="微軟正黑體"/>
-                <w:rFonts w:eastAsia="微軟正黑體"/>
-                <w:b w:val="0"/>
-                <w:sz w:val="18"/>
-              </w:rPr>
-              <w:t>1. 每個小正方形內部剛好裝有 1 整片花瓣。</w:t>
-            </w:r>
-          </w:p>
-          <w:p>
-            <w:pPr>
-              <w:spacing w:line="276" w:lineRule="auto" w:after="40" w:before="40"/>
-              <w:jc w:val="left"/>
-            </w:pPr>
-            <w:r>
-              <w:rPr>
-                <w:rFonts w:ascii="微軟正黑體" w:hAnsi="微軟正黑體"/>
-                <w:rFonts w:eastAsia="微軟正黑體"/>
-                <w:b w:val="0"/>
-                <w:sz w:val="18"/>
-              </w:rPr>
-              <w:t>2. 1 整片花瓣 = 28.5 × 2 = 57 (m²)</w:t>
-            </w:r>
-          </w:p>
-          <w:p>
-            <w:pPr>
-              <w:spacing w:line="276" w:lineRule="auto" w:after="40" w:before="40"/>
-              <w:jc w:val="left"/>
-            </w:pPr>
-            <w:r>
-              <w:rPr>
-                <w:rFonts w:ascii="微軟正黑體" w:hAnsi="微軟正黑體"/>
-                <w:rFonts w:eastAsia="微軟正黑體"/>
-                <w:b w:val="0"/>
-                <w:sz w:val="18"/>
-              </w:rPr>
-              <w:t>3. 4 片花瓣總面積 = 57 × 4 = 228 (m²)</w:t>
-            </w:r>
-          </w:p>
-          <w:p>
-            <w:pPr>
-              <w:spacing w:line="276" w:lineRule="auto" w:after="40" w:before="40"/>
-              <w:jc w:val="left"/>
-            </w:pPr>
-            <w:r>
-              <w:rPr>
-                <w:rFonts w:ascii="微軟正黑體" w:hAnsi="微軟正黑體"/>
-                <w:rFonts w:eastAsia="微軟正黑體"/>
-                <w:b w:val="0"/>
-                <w:sz w:val="18"/>
-              </w:rPr>
-            </w:r>
-          </w:p>
-          <w:p>
-            <w:pPr>
-              <w:spacing w:line="276" w:lineRule="auto" w:after="40" w:before="40"/>
-              <w:jc w:val="left"/>
-            </w:pPr>
-            <w:r>
-              <w:rPr>
-                <w:rFonts w:ascii="微軟正黑體" w:hAnsi="微軟正黑體"/>
-                <w:rFonts w:eastAsia="微軟正黑體"/>
-                <w:b w:val="0"/>
-                <w:sz w:val="18"/>
-              </w:rPr>
-              <w:t>答：___________ 平方公尺</w:t>
-            </w:r>
-          </w:p>
-        </w:tc>
-        <w:tc>
-          <w:tcPr>
-            <w:tcW w:type="dxa" w:w="5256"/>
-            <w:tcMar>
-              <w:top w:w="60" w:type="dxa"/>
-              <w:bottom w:w="60" w:type="dxa"/>
-              <w:left w:w="80" w:type="dxa"/>
-              <w:right w:w="80" w:type="dxa"/>
-            </w:tcMar>
-          </w:tcPr>
-          <w:p>
-            <w:pPr>
-              <w:spacing w:line="276" w:lineRule="auto" w:after="40" w:before="40"/>
-              <w:jc w:val="left"/>
-            </w:pPr>
-            <w:r>
-              <w:rPr>
-                <w:rFonts w:ascii="微軟正黑體" w:hAnsi="微軟正黑體"/>
-                <w:rFonts w:eastAsia="微軟正黑體"/>
-                <w:b w:val="0"/>
-                <w:sz w:val="18"/>
-              </w:rPr>
-              <w:t>【解題策略二：容斥原理神解法】</w:t>
-            </w:r>
-          </w:p>
-          <w:p>
-            <w:pPr>
-              <w:spacing w:line="276" w:lineRule="auto" w:after="40" w:before="40"/>
-              <w:jc w:val="left"/>
-            </w:pPr>
-            <w:r>
-              <w:rPr>
-                <w:rFonts w:ascii="微軟正黑體" w:hAnsi="微軟正黑體"/>
-                <w:rFonts w:eastAsia="微軟正黑體"/>
-                <w:b w:val="0"/>
-                <w:sz w:val="18"/>
-              </w:rPr>
-              <w:t>★ 觀察想法：8 個扇形鋪滿正方形重疊！</w:t>
-            </w:r>
-          </w:p>
-          <w:p>
-            <w:pPr>
-              <w:spacing w:line="276" w:lineRule="auto" w:after="40" w:before="40"/>
-              <w:jc w:val="left"/>
-            </w:pPr>
-            <w:r>
-              <w:rPr>
-                <w:rFonts w:ascii="微軟正黑體" w:hAnsi="微軟正黑體"/>
-                <w:rFonts w:eastAsia="微軟正黑體"/>
-                <w:b w:val="0"/>
-                <w:sz w:val="18"/>
-              </w:rPr>
-              <w:t>我的算式與推理：</w:t>
-            </w:r>
-          </w:p>
-          <w:p>
-            <w:pPr>
-              <w:spacing w:line="276" w:lineRule="auto" w:after="40" w:before="40"/>
-              <w:jc w:val="left"/>
-            </w:pPr>
-            <w:r>
-              <w:rPr>
-                <w:rFonts w:ascii="微軟正黑體" w:hAnsi="微軟正黑體"/>
-                <w:rFonts w:eastAsia="微軟正黑體"/>
-                <w:b w:val="0"/>
-                <w:sz w:val="18"/>
-              </w:rPr>
-              <w:t>1. 8 個 1/4 圓總面積 = 2 × (10×10×3.14) = 628 (m²)</w:t>
-            </w:r>
-          </w:p>
-          <w:p>
-            <w:pPr>
-              <w:spacing w:line="276" w:lineRule="auto" w:after="40" w:before="40"/>
-              <w:jc w:val="left"/>
-            </w:pPr>
-            <w:r>
-              <w:rPr>
-                <w:rFonts w:ascii="微軟正黑體" w:hAnsi="微軟正黑體"/>
-                <w:rFonts w:eastAsia="微軟正黑體"/>
-                <w:b w:val="0"/>
-                <w:sz w:val="18"/>
-              </w:rPr>
-              <w:t>2. 大正方形面積 = 20 × 20 = 400 (m²)</w:t>
-            </w:r>
-          </w:p>
-          <w:p>
-            <w:pPr>
-              <w:spacing w:line="276" w:lineRule="auto" w:after="40" w:before="40"/>
-              <w:jc w:val="left"/>
-            </w:pPr>
-            <w:r>
-              <w:rPr>
-                <w:rFonts w:ascii="微軟正黑體" w:hAnsi="微軟正黑體"/>
-                <w:rFonts w:eastAsia="微軟正黑體"/>
-                <w:b w:val="0"/>
-                <w:sz w:val="18"/>
-              </w:rPr>
-              <w:t>3. 重疊花瓣面積 = 628 - 400 = 228 (m²)</w:t>
-            </w:r>
-          </w:p>
-          <w:p>
-            <w:pPr>
-              <w:spacing w:line="276" w:lineRule="auto" w:after="40" w:before="40"/>
-              <w:jc w:val="left"/>
-            </w:pPr>
-            <w:r>
-              <w:rPr>
-                <w:rFonts w:ascii="微軟正黑體" w:hAnsi="微軟正黑體"/>
-                <w:rFonts w:eastAsia="微軟正黑體"/>
-                <w:b w:val="0"/>
-                <w:sz w:val="18"/>
-              </w:rPr>
-            </w:r>
-          </w:p>
-          <w:p>
-            <w:pPr>
-              <w:spacing w:line="276" w:lineRule="auto" w:after="40" w:before="40"/>
-              <w:jc w:val="left"/>
-            </w:pPr>
-            <w:r>
-              <w:rPr>
-                <w:rFonts w:ascii="微軟正黑體" w:hAnsi="微軟正黑體"/>
-                <w:rFonts w:eastAsia="微軟正黑體"/>
-                <w:b w:val="0"/>
-                <w:sz w:val="18"/>
-              </w:rPr>
-              <w:t>答：___________ 平方公尺</w:t>
-            </w:r>
-          </w:p>
-        </w:tc>
-      </w:tr>
-    </w:tbl>
+    <w:p>
+      <w:pPr>
+        <w:pStyle w:val="Heading2"/>
+      </w:pPr>
+      <w:r>
+        <w:t>🌟 第四部分：高光頓悟與學習反思（個人沉澱 8 分鐘）</w:t>
+      </w:r>
+    </w:p>
+    <w:p>
+      <w:r>
+        <w:t>1. 💡 我今天最棒的數學新發現：</w:t>
+        <w:br/>
+        <w:t xml:space="preserve">   _____________________________________________________________________________________</w:t>
+        <w:br/>
+        <w:br/>
+        <w:t>2. 🤝 我想感謝同組組員的幫助與啟發：</w:t>
+        <w:br/>
+        <w:t xml:space="preserve">   _____________________________________________________________________________________</w:t>
+        <w:br/>
+        <w:br/>
+        <w:t>3. ⭐ 自我學習評估：</w:t>
+        <w:br/>
+        <w:t xml:space="preserve">   [  ] 我能專注傾聽組員的想法與解法　　　　　[  ] 我勇於說出「我不懂」並向同伴請教</w:t>
+        <w:br/>
+        <w:t xml:space="preserve">   [  ] 我能用自己的話清晰解釋算式幾何意義　　[  ] 我體會到了幾何圖形重疊、容斥與守恆的奧妙</w:t>
+      </w:r>
+    </w:p>
     <w:sectPr>
       <w:pgSz w:w="12240" w:h="15840"/>
-      <w:pgMar w:top="720" w:right="864" w:bottom="720" w:left="864" w:header="720" w:footer="720" w:gutter="0"/>
+      <w:pgMar w:top="864" w:right="1008" w:bottom="864" w:left="1008" w:header="720" w:footer="720" w:gutter="0"/>
       <w:cols w:space="720"/>
       <w:docGrid w:linePitch="360"/>
     </w:sectPr>

</xml_diff>